<commit_message>
Update resume originals to current master copies
resume/Corderio_Vonner_Resume.docx now matches the master DOCX and docs/resume-data.js carries the same updated career summary. The PDF update landed in ab37977.
</commit_message>
<xml_diff>
--- a/resume/Corderio_Vonner_Resume.docx
+++ b/resume/Corderio_Vonner_Resume.docx
@@ -145,7 +145,7 @@
           <w:szCs w:val="21"/>
           <w:rtl w:val="0"/>
         </w:rPr>
-        <w:t xml:space="preserve">Senior AI Agentic Engineer with 4+ years designing and implementing enterprise-grade security architectures, threat detection pipelines, and automated response systems — now centered on Agentic AI, GenAI, and multi-agent systems built with LangChain, LangGraph, and Model Context Protocol (MCP). Built Cox's Agentic AI Center of Excellence; design and orchestrate multi-agent systems—tool/function calling, agent identity and least privilege, RAG, agent handoffs, and human-in-the-loop control—across Claude, Gemini, GPT, Meta Llama, Mistral, DeepSeek, Grok, and Azure OpenAI on AKS.</w:t>
+        <w:t xml:space="preserve">Principal AI Agentic Engineer with 8+ years security/DevSecOps, with the last 2+ years focused on Agentic AI, LLM systems built with LangChain, LangGraph, and Model Context Protocol (MCP). Built Cox's Agentic AI Center of Excellence; design and orchestrate multi-agent systems—tool/function calling, agent identity and least privilege, RAG, agent handoffs, and human-in-the-loop control—across Claude, Gemini, GPT, Meta Llama, Mistral, DeepSeek, Grok, and Azure OpenAI on AKS.</w:t>
       </w:r>
       <w:r>
         <w:rPr>
@@ -479,11 +479,6 @@
         </w:rPr>
         <w:t xml:space="preserve">Lead the design of Cox's enterprise multi-agent AI platform on LangChain, LangGraph, and MCP, orchestrating supervisor, hierarchical, and swarm agent topologies across Cox Automotive, Cox Communications, and Cox Media Group.</w:t>
       </w:r>
-      <w:r>
-        <w:rPr>
-          <w:rtl w:val="0"/>
-        </w:rPr>
-      </w:r>
     </w:p>
     <w:p>
       <w:pPr>
@@ -506,11 +501,6 @@
         </w:rPr>
         <w:t xml:space="preserve">Deliver multi-agent AI assistants (tool calling, RAG, memory) across Cox business units and Cox-owned brands including Kelley Blue Book and Autotrader, automating high-volume workflows.</w:t>
       </w:r>
-      <w:r>
-        <w:rPr>
-          <w:rtl w:val="0"/>
-        </w:rPr>
-      </w:r>
     </w:p>
     <w:p>
       <w:pPr>
@@ -533,11 +523,6 @@
         </w:rPr>
         <w:t xml:space="preserve">Architect stateful multi-agent workflows in LangGraph (durable state, checkpointing, interrupts, human-in-the-loop approval) for long-running, production-grade agents.</w:t>
       </w:r>
-      <w:r>
-        <w:rPr>
-          <w:rtl w:val="0"/>
-        </w:rPr>
-      </w:r>
     </w:p>
     <w:p>
       <w:pPr>
@@ -560,11 +545,6 @@
         </w:rPr>
         <w:t xml:space="preserve">Standardize MCP server/client architecture (JSON-RPC 2.0, OAuth 2.1) to expose databases, APIs, and internal tools to agents through a governed, reusable, auditable tool layer.</w:t>
       </w:r>
-      <w:r>
-        <w:rPr>
-          <w:rtl w:val="0"/>
-        </w:rPr>
-      </w:r>
     </w:p>
     <w:p>
       <w:pPr>
@@ -587,11 +567,6 @@
         </w:rPr>
         <w:t xml:space="preserve">Govern a shared MCP tool catalog and multi-agent registry, enforcing versioning, access control, and safe reuse across teams.</w:t>
       </w:r>
-      <w:r>
-        <w:rPr>
-          <w:rtl w:val="0"/>
-        </w:rPr>
-      </w:r>
     </w:p>
     <w:p>
       <w:pPr>
@@ -614,11 +589,6 @@
         </w:rPr>
         <w:t xml:space="preserve">Deliver multi-agent RAG pipelines with hybrid retrieval, reranking, and vector stores, using LangSmith tracing and evals to raise answer quality and cut hallucination.</w:t>
       </w:r>
-      <w:r>
-        <w:rPr>
-          <w:rtl w:val="0"/>
-        </w:rPr>
-      </w:r>
     </w:p>
     <w:p>
       <w:pPr>
@@ -641,11 +611,6 @@
         </w:rPr>
         <w:t xml:space="preserve">Ship agentic AI to production across Claude, Gemini, GPT, Meta Llama, Mistral, DeepSeek, Grok, and Azure OpenAI on AKS, tuning latency, cost, and autoscaling for millions of daily inference calls.</w:t>
       </w:r>
-      <w:r>
-        <w:rPr>
-          <w:rtl w:val="0"/>
-        </w:rPr>
-      </w:r>
     </w:p>
     <w:p>
       <w:pPr>
@@ -668,11 +633,6 @@
         </w:rPr>
         <w:t xml:space="preserve">Enforce agent identity, least-privilege tool authorization, and non-human identity (NHI) governance to stop unauthorized tool execution and privilege escalation.</w:t>
       </w:r>
-      <w:r>
-        <w:rPr>
-          <w:rtl w:val="0"/>
-        </w:rPr>
-      </w:r>
     </w:p>
     <w:p>
       <w:pPr>
@@ -695,11 +655,6 @@
         </w:rPr>
         <w:t xml:space="preserve">Lead agentic AI red-teaming (prompt injection, tool poisoning, jailbreak) and deploy NeMo Guardrails plus LlamaGuard input/output filtering to contain rogue agent behavior.</w:t>
       </w:r>
-      <w:r>
-        <w:rPr>
-          <w:rtl w:val="0"/>
-        </w:rPr>
-      </w:r>
     </w:p>
     <w:p>
       <w:pPr>
@@ -722,11 +677,6 @@
         </w:rPr>
         <w:t xml:space="preserve">Operate observability and kill-switch containment to detect agent drift, loops, and unsafe autonomy and halt compromised agents in real time.</w:t>
       </w:r>
-      <w:r>
-        <w:rPr>
-          <w:rtl w:val="0"/>
-        </w:rPr>
-      </w:r>
     </w:p>
     <w:p>
       <w:pPr>
@@ -749,11 +699,6 @@
         </w:rPr>
         <w:t xml:space="preserve">Built the Cox Agentic AI Center of Excellence and helped establish the Cox Security Center of Excellence, setting enterprise standards for multi-agent architecture, MCP governance, evals, DevSecOps, IAM, DLP, and incident response.</w:t>
       </w:r>
-      <w:r>
-        <w:rPr>
-          <w:rtl w:val="0"/>
-        </w:rPr>
-      </w:r>
     </w:p>
     <w:p>
       <w:pPr>
@@ -776,11 +721,6 @@
         </w:rPr>
         <w:t xml:space="preserve">Delivered the automated SecOps platform protecting 40K+ employees, processing 1.8M + daily security events across 40,000+ endpoints at sub-second latency, driving $12M+ in annual risk-reduction savings.</w:t>
       </w:r>
-      <w:r>
-        <w:rPr>
-          <w:rtl w:val="0"/>
-        </w:rPr>
-      </w:r>
     </w:p>
     <w:p>
       <w:pPr>
@@ -802,11 +742,6 @@
           <w:rtl w:val="0"/>
         </w:rPr>
         <w:t xml:space="preserve">Modernized the agent runtime to LangChain/LangGraph 1.0 (create_agent plus middleware) to standardize agent behavior and retire legacy chains.</w:t>
-      </w:r>
-      <w:r>
-        <w:rPr>
-          <w:rtl w:val="0"/>
-        </w:rPr>
       </w:r>
     </w:p>
     <w:p>
@@ -909,11 +844,6 @@
         </w:rPr>
         <w:t xml:space="preserve">Built production agentic AI systems with LangChain and LangGraph, wiring LLM reasoning loops to enterprise tools through function calling.</w:t>
       </w:r>
-      <w:r>
-        <w:rPr>
-          <w:rtl w:val="0"/>
-        </w:rPr>
-      </w:r>
     </w:p>
     <w:p>
       <w:pPr>
@@ -936,11 +866,6 @@
         </w:rPr>
         <w:t xml:space="preserve">Implemented MCP servers to standardize tool and data access for agents, adding schema validation, auth, and tool-poisoning defenses after MCP's public release (Nov 2024).</w:t>
       </w:r>
-      <w:r>
-        <w:rPr>
-          <w:rtl w:val="0"/>
-        </w:rPr>
-      </w:r>
     </w:p>
     <w:p>
       <w:pPr>
@@ -963,11 +888,6 @@
         </w:rPr>
         <w:t xml:space="preserve">Designed multi-agent RAG architectures with retrieval, memory, and agent handoff for customer-facing and internal workflows.</w:t>
       </w:r>
-      <w:r>
-        <w:rPr>
-          <w:rtl w:val="0"/>
-        </w:rPr>
-      </w:r>
     </w:p>
     <w:p>
       <w:pPr>
@@ -990,11 +910,6 @@
         </w:rPr>
         <w:t xml:space="preserve">Built tool/function-call authorization and per-agent least-privilege scopes to constrain agent actions.</w:t>
       </w:r>
-      <w:r>
-        <w:rPr>
-          <w:rtl w:val="0"/>
-        </w:rPr>
-      </w:r>
     </w:p>
     <w:p>
       <w:pPr>
@@ -1017,11 +932,6 @@
         </w:rPr>
         <w:t xml:space="preserve">Instrumented LangSmith tracing and evals to measure agent reliability and catch regressions.</w:t>
       </w:r>
-      <w:r>
-        <w:rPr>
-          <w:rtl w:val="0"/>
-        </w:rPr>
-      </w:r>
     </w:p>
     <w:p>
       <w:pPr>
@@ -1043,11 +953,6 @@
           <w:rtl w:val="0"/>
         </w:rPr>
         <w:t xml:space="preserve">Hardened agentic cloud architectures across AWS, Azure, and GCP with Zero Trust, segmentation, and private networking (VPC/PrivateLink).</w:t>
-      </w:r>
-      <w:r>
-        <w:rPr>
-          <w:rtl w:val="0"/>
-        </w:rPr>
       </w:r>
     </w:p>
     <w:p>
@@ -1149,11 +1054,6 @@
         </w:rPr>
         <w:t xml:space="preserve">Built GenAI applications with LangChain and LangGraph spanning RAG assistants, summarization, and document Q&amp;A.</w:t>
       </w:r>
-      <w:r>
-        <w:rPr>
-          <w:rtl w:val="0"/>
-        </w:rPr>
-      </w:r>
     </w:p>
     <w:p>
       <w:pPr>
@@ -1176,11 +1076,6 @@
         </w:rPr>
         <w:t xml:space="preserve">Built RAG pipelines over Postgres, Snowflake, and vector stores with embeddings and retrieval tuning.</w:t>
       </w:r>
-      <w:r>
-        <w:rPr>
-          <w:rtl w:val="0"/>
-        </w:rPr>
-      </w:r>
     </w:p>
     <w:p>
       <w:pPr>
@@ -1203,11 +1098,6 @@
         </w:rPr>
         <w:t xml:space="preserve">Pioneered GenAI security baselines across AWS, Azure, and GCP, setting org-wide AI threat-defense and compliance standards.</w:t>
       </w:r>
-      <w:r>
-        <w:rPr>
-          <w:rtl w:val="0"/>
-        </w:rPr>
-      </w:r>
     </w:p>
     <w:p>
       <w:pPr>
@@ -1230,11 +1120,6 @@
         </w:rPr>
         <w:t xml:space="preserve">Integrated DevSecOps gates and SAST/DAST into the AI SDLC to remediate GenAI application vulnerabilities pre-deployment.</w:t>
       </w:r>
-      <w:r>
-        <w:rPr>
-          <w:rtl w:val="0"/>
-        </w:rPr>
-      </w:r>
     </w:p>
     <w:p>
       <w:pPr>
@@ -1256,11 +1141,6 @@
           <w:rtl w:val="0"/>
         </w:rPr>
         <w:t xml:space="preserve">Delivered GenAI solutions across Cox Automotive brands including Kelley Blue Book, Autotrader, and Manheim.</w:t>
-      </w:r>
-      <w:r>
-        <w:rPr>
-          <w:rtl w:val="0"/>
-        </w:rPr>
       </w:r>
     </w:p>
     <w:p>
@@ -1362,11 +1242,6 @@
         </w:rPr>
         <w:t xml:space="preserve">Built LLM applications with LangChain and Azure/OpenAI models, including RAG document ingestion and semantic search across Knowledge bases.</w:t>
       </w:r>
-      <w:r>
-        <w:rPr>
-          <w:rtl w:val="0"/>
-        </w:rPr>
-      </w:r>
     </w:p>
     <w:p>
       <w:pPr>
@@ -1389,11 +1264,6 @@
         </w:rPr>
         <w:t xml:space="preserve">Engineered secure LLM document-ingestion workflows with Data Loss Prevention (DLP), PII redaction, and end-to-end payload encryption.</w:t>
       </w:r>
-      <w:r>
-        <w:rPr>
-          <w:rtl w:val="0"/>
-        </w:rPr>
-      </w:r>
     </w:p>
     <w:p>
       <w:pPr>
@@ -1416,11 +1286,6 @@
         </w:rPr>
         <w:t xml:space="preserve">Embedded OWASP Top 10 defenses and input validation across Python and Node.js AI services.</w:t>
       </w:r>
-      <w:r>
-        <w:rPr>
-          <w:rtl w:val="0"/>
-        </w:rPr>
-      </w:r>
     </w:p>
     <w:p>
       <w:pPr>
@@ -1442,11 +1307,6 @@
           <w:rtl w:val="0"/>
         </w:rPr>
         <w:t xml:space="preserve">Hardened multi-cloud AI infrastructure on AWS and Azure with PrivateLink, key rotation, and mTLS.</w:t>
-      </w:r>
-      <w:r>
-        <w:rPr>
-          <w:rtl w:val="0"/>
-        </w:rPr>
       </w:r>
     </w:p>
     <w:p>
@@ -1548,11 +1408,6 @@
         </w:rPr>
         <w:t xml:space="preserve">Architected secure AI/ML network gateways and private endpoints (Azure PrivateLink), isolating model traffic from the public internet.</w:t>
       </w:r>
-      <w:r>
-        <w:rPr>
-          <w:rtl w:val="0"/>
-        </w:rPr>
-      </w:r>
     </w:p>
     <w:p>
       <w:pPr>
@@ -1575,11 +1430,6 @@
         </w:rPr>
         <w:t xml:space="preserve">Designed micro-segmented AI network architectures with Next-Generation Firewalls (NGFW) and egress filtering to prevent exfiltration and lateral movement.</w:t>
       </w:r>
-      <w:r>
-        <w:rPr>
-          <w:rtl w:val="0"/>
-        </w:rPr>
-      </w:r>
     </w:p>
     <w:p>
       <w:pPr>
@@ -1601,11 +1451,6 @@
           <w:rtl w:val="0"/>
         </w:rPr>
         <w:t xml:space="preserve">Evaluated emerging LLM orchestration frameworks for secure AI service routing and prompt-to-endpoint pipelines.</w:t>
-      </w:r>
-      <w:r>
-        <w:rPr>
-          <w:rtl w:val="0"/>
-        </w:rPr>
       </w:r>
     </w:p>
     <w:p>
@@ -1707,11 +1552,6 @@
         </w:rPr>
         <w:t xml:space="preserve">Architected secure CI/CD and infrastructure-as-code in Terraform &amp; Kubernetes with automated SAST/DAST, secret scanning, and policy-as-code gates.</w:t>
       </w:r>
-      <w:r>
-        <w:rPr>
-          <w:rtl w:val="0"/>
-        </w:rPr>
-      </w:r>
     </w:p>
     <w:p>
       <w:pPr>
@@ -1734,11 +1574,6 @@
         </w:rPr>
         <w:t xml:space="preserve">Enforced least-privilege IAM, RBAC, and secrets management across GCP (Composer, Pub/Sub, Dataflow) to secure real-time ETL/ML pipelines.</w:t>
       </w:r>
-      <w:r>
-        <w:rPr>
-          <w:rtl w:val="0"/>
-        </w:rPr>
-      </w:r>
     </w:p>
     <w:p>
       <w:pPr>
@@ -1760,11 +1595,6 @@
           <w:rtl w:val="0"/>
         </w:rPr>
         <w:t xml:space="preserve">Hardened a governed GCP lakehouse (BigQuery, Dataplex) with DLP, encryption, and access controls, delivering secure AI/ML-ready analytics to 200 stakeholders.</w:t>
-      </w:r>
-      <w:r>
-        <w:rPr>
-          <w:rtl w:val="0"/>
-        </w:rPr>
       </w:r>
     </w:p>
     <w:p>
@@ -1866,11 +1696,6 @@
         </w:rPr>
         <w:t xml:space="preserve">Built hardened CI/CD pipelines with automated security scanning, secrets management, and least-privilege access controls.</w:t>
       </w:r>
-      <w:r>
-        <w:rPr>
-          <w:rtl w:val="0"/>
-        </w:rPr>
-      </w:r>
     </w:p>
     <w:p>
       <w:pPr>
@@ -1893,11 +1718,6 @@
         </w:rPr>
         <w:t xml:space="preserve">Automated secure infrastructure-as-code (Terraform, Kubernetes) with policy enforcement and monitoring for terminal and yard systems.</w:t>
       </w:r>
-      <w:r>
-        <w:rPr>
-          <w:rtl w:val="0"/>
-        </w:rPr>
-      </w:r>
     </w:p>
     <w:p>
       <w:pPr>
@@ -1919,11 +1739,6 @@
           <w:rtl w:val="0"/>
         </w:rPr>
         <w:t xml:space="preserve">Secured containerized microservices (Express, FastAPI) with API gateway hardening, mTLS, and runtime protection, cutting truck turn times 25%.</w:t>
-      </w:r>
-      <w:r>
-        <w:rPr>
-          <w:rtl w:val="0"/>
-        </w:rPr>
       </w:r>
     </w:p>
     <w:bookmarkStart w:colFirst="0" w:colLast="0" w:name="bookmark=id.l2hw2nuli3jm" w:id="1"/>
@@ -2208,6 +2023,20 @@
       <w:sz w:val="72"/>
       <w:szCs w:val="72"/>
     </w:rPr>
+  </w:style>
+  <w:style w:type="table" w:styleId="TableNormal" w:default="1">
+    <w:name w:val="TableNormal"/>
+    <w:tblPr>
+      <w:tblCellMar>
+        <w:top w:w="100.0" w:type="dxa"/>
+        <w:left w:w="100.0" w:type="dxa"/>
+        <w:bottom w:w="100.0" w:type="dxa"/>
+        <w:right w:w="100.0" w:type="dxa"/>
+      </w:tblCellMar>
+    </w:tblPr>
+  </w:style>
+  <w:style w:type="paragraph" w:styleId="Normal" w:default="1">
+    <w:name w:val="normal"/>
   </w:style>
   <w:style w:type="table" w:styleId="TableNormal" w:default="1">
     <w:name w:val="TableNormal"/>
@@ -2567,7 +2396,7 @@
 
 <file path=customXML/item1.xml><?xml version="1.0" encoding="utf-8"?>
 <go:gDocsCustomXmlDataStorage xmlns:go="http://customooxmlschemas.google.com/" xmlns:r="http://schemas.openxmlformats.org/officeDocument/2006/relationships" uri="GoogleDocsCustomDataVersion2">
-  <go:docsCustomData xmlns:go="http://customooxmlschemas.google.com/" roundtripDataSignature="AMtx7mieJGeeGkyFjAhlPwa9rwMfpEq5hg==">CgMxLjAyD2lkLmR2NXdoeHYxZWx1cTIPaWQubDJodzJudWxpM2ptMg9pZC50Mm03YWFkYmc1aWkyD2lkLmZqMnBqb3V6b292dzIPaWQuazdjeDJpOGR1NWltMg9pZC5paGtka3M2eDVzcnI4AHIhMXdtb2Q5dnZYRURyN1Itc19oX0tyU2YtaWx6SW5WNjRH</go:docsCustomData>
+  <go:docsCustomData xmlns:go="http://customooxmlschemas.google.com/" roundtripDataSignature="AMtx7mhI8luUUH0U5I/9pcpz6SVImQwgSw==">CgMxLjAyD2lkLmR2NXdoeHYxZWx1cTIPaWQubDJodzJudWxpM2ptMg9pZC50Mm03YWFkYmc1aWkyD2lkLmZqMnBqb3V6b292dzIPaWQuazdjeDJpOGR1NWltMg9pZC5paGtka3M2eDVzcnI4AHIhMUNNQWVVa1gxVXJWM1VvT21OdW1RSFFnTk1ESkxvQ3ZO</go:docsCustomData>
 </go:gDocsCustomXmlDataStorage>
 </file>
 

</xml_diff>